<commit_message>
Update title to Title B, audit citations/abbreviations/figure numbering
Title: 'What Zeroing Cannot Fix: Concordance Analysis Unmasks Gain Errors Invisible to Bland-Altman'

Changes:
- Updated title in EN, JA scripts, and cover letter
- Added 6 missing citations: Cecconi 2009, Chatterjee 2009, Kim 2014, McBride 2005, Romagnoli 2013, Scalia 2023
- Defined 6 abbreviations at first mention: MEMS, SBP/DBP, DC/AC, FDA, SV
- Renumbered figures to match order of first appearance in text (swapped 2<->3, reordered 6/7/8)
- Regenerated all docx files

Co-Authored-By: Tatsuki Onishi <bougtoir@gmail.com>
</commit_message>
<xml_diff>
--- a/zero_calibration_pmea/manuscripts/PMEA_ZeroFree_Manuscript_EN.docx
+++ b/zero_calibration_pmea/manuscripts/PMEA_ZeroFree_Manuscript_EN.docx
@@ -29,7 +29,7 @@
           <w:b/>
           <w:sz w:val="32"/>
         </w:rPr>
-        <w:t>Concordance Correlation Coefficient Decomposition Reveals That Zero Calibration Corrects Offset but Not Gain: A Simulation-Based Framework for Arterial Pressure Monitor Validation</w:t>
+        <w:t>What Zeroing Cannot Fix: Concordance Analysis Unmasks Gain Errors Invisible to Bland–Altman</w:t>
       </w:r>
     </w:p>
     <w:p>
@@ -44,7 +44,7 @@
           <w:i/>
           <w:sz w:val="24"/>
         </w:rPr>
-        <w:t>Running title: CCC decomposition for arterial pressure validation</w:t>
+        <w:t>Running title: What zeroing cannot fix</w:t>
       </w:r>
     </w:p>
     <w:p/>
@@ -256,7 +256,7 @@
           <w:i w:val="0"/>
           <w:sz w:val="24"/>
         </w:rPr>
-        <w:t>We decompose the CCC into precision (Pearson’s r) and accuracy (bias correction factor, C₂) components, where C₂ is further resolved into location shift (u, offset) and scale shift (v, gain error). We simulate four clinically relevant scenarios of arterial pressure measurement (n = 150 paired measurements each): offset only, offset corrected by zeroing, gain error, and combined gain plus offset error. Each scenario is analysed using both Bland–Altman statistics and CCC decomposition. We also identify three engineering solutions —catheter-tip MEMS sensors, barometric compensation, and self-calibrating MEMS—that eliminate the need for manual zero calibration.</w:t>
+        <w:t>We decompose the CCC into precision (Pearson’s r) and accuracy (bias correction factor, C₂) components, where C₂ is further resolved into location shift (u, offset) and scale shift (v, gain error). We simulate four clinically relevant scenarios of arterial pressure measurement (n = 150 paired measurements each): offset only, offset corrected by zeroing, gain error, and combined gain plus offset error. Each scenario is analysed using both Bland–Altman statistics and CCC decomposition. We also identify three engineering solutions —catheter-tip micro-electro-mechanical systems (MEMS) sensors, barometric compensation, and self-calibrating MEMS—that eliminate the need for manual zero calibration.</w:t>
       </w:r>
     </w:p>
     <w:p>
@@ -385,7 +385,7 @@
           <w:i w:val="0"/>
           <w:sz w:val="24"/>
         </w:rPr>
-        <w:t>The standard validation framework for haemodynamic monitors centres on Bland–Altman analysis (Bland and Altman 1986, 1999), the Critchley–Critchley percentage error criterion (Critchley and Critchley 1999), and polar plot assessment for trending ability (Critchley et al 2010, 2011). While these tools effectively evaluate bias, limits of agreement, and directional concordance, none provides an integrated single-value metric that simultaneously captures both accuracy and precision of absolute measurements against the line of perfect agreement.</w:t>
+        <w:t>The standard validation framework for haemodynamic monitors centres on Bland–Altman analysis (Bland and Altman 1986, 1999), the Critchley–Critchley percentage error criterion (Critchley and Critchley 1999), and polar plot assessment for trending ability (Critchley et al 2010, 2011), with particular attention to the precision of the reference technique (Cecconi et al 2009). While these tools effectively evaluate bias, limits of agreement, and directional concordance, none provides an integrated single-value metric that simultaneously captures both accuracy and precision of absolute measurements against the line of perfect agreement.</w:t>
       </w:r>
     </w:p>
     <w:p>
@@ -437,7 +437,7 @@
           <w:i w:val="0"/>
           <w:sz w:val="24"/>
         </w:rPr>
-        <w:t>An arterial pressure waveform P(t) can be decomposed into a slowly varying component (the DC level, determined by mean arterial pressure and any external offsets) and a pulsatile component (the AC signal, driven by cardiac ejection). Pulse pressure (PP = SBP – DBP) is a pure AC quantity: it represents the difference between the maximum and minimum of the pulsatile excursion and is, by definition, independent of any additive DC offset (figure 1, panels A and B).</w:t>
+        <w:t>An arterial pressure waveform P(t) can be decomposed into a slowly varying component (the direct-current (DC) level, determined by mean arterial pressure and any external offsets) and a pulsatile component (the alternating-current (AC) signal, driven by cardiac ejection). Pulse pressure (PP = systolic blood pressure [SBP] – diastolic blood pressure [DBP]) is a pure AC quantity: it represents the difference between the maximum and minimum of the pulsatile excursion and is, by definition, independent of any additive DC offset (figure 1, panels A and B).</w:t>
       </w:r>
     </w:p>
     <w:p>
@@ -533,7 +533,7 @@
           <w:i w:val="0"/>
           <w:sz w:val="24"/>
         </w:rPr>
-        <w:t>When all three solutions are implemented simultaneously—tip sensor, absolute pressure with barometric compensation, and self-calibrating reference—every source of DC offset is eliminated by design. Manual zero calibration becomes redundant (figure 3).</w:t>
+        <w:t>When all three solutions are implemented simultaneously—tip sensor, absolute pressure with barometric compensation, and self-calibrating reference—every source of DC offset is eliminated by design. Manual zero calibration becomes redundant (figure 2).</w:t>
       </w:r>
     </w:p>
     <w:p>
@@ -641,7 +641,7 @@
           <w:i w:val="0"/>
           <w:sz w:val="24"/>
         </w:rPr>
-        <w:t>Zero calibration is an operation that drives u toward zero by removing the systematic offset between the device reading and the true pressure. In CCC terms, successful zeroing achieves u ≈ 0, which maximises C₂ with respect to the location component. However, zeroing has no effect on v: if the sensor gain is incorrect (v ≠ 1), C₂ remains below 1.0 even after perfect zeroing (figures 2 and 4).</w:t>
+        <w:t>Zero calibration is an operation that drives u toward zero by removing the systematic offset between the device reading and the true pressure. In CCC terms, successful zeroing achieves u ≈ 0, which maximises C₂ with respect to the location component. However, zeroing has no effect on v: if the sensor gain is incorrect (v ≠ 1), C₂ remains below 1.0 even after perfect zeroing (figures 3 and 4).</w:t>
       </w:r>
     </w:p>
     <w:p>
@@ -801,7 +801,7 @@
           <w:i w:val="0"/>
           <w:sz w:val="24"/>
         </w:rPr>
-        <w:t>Figure 2 shows concordance plots for the four simulated scenarios. Scenario A (offset only, before zeroing) shows reduced CCC (0.855) due to location shift (u = –0.55). Scenario B (after zeroing) shows near-perfect agreement (CCC = 0.986, C₂ = 1.000) because the offset has been removed and no gain error exists. Scenario C (gain error, v = 1.11) shows that zeroing cannot improve C₂ (0.870) because the scale shift persists. Scenario D (gain + offset) shows CCC = 0.976; zeroing would improve it to Scenario C but not to Scenario B.</w:t>
+        <w:t>Figure 3 shows concordance plots for the four simulated scenarios. Scenario A (offset only, before zeroing) shows reduced CCC (0.855) due to location shift (u = –0.55). Scenario B (after zeroing) shows near-perfect agreement (CCC = 0.986, C₂ = 1.000) because the offset has been removed and no gain error exists. Scenario C (gain error, v = 1.11) shows that zeroing cannot improve C₂ (0.870) because the scale shift persists. Scenario D (gain + offset) shows CCC = 0.976; zeroing would improve it to Scenario C but not to Scenario B.</w:t>
       </w:r>
     </w:p>
     <w:p>
@@ -827,7 +827,7 @@
           <w:i w:val="0"/>
           <w:sz w:val="24"/>
         </w:rPr>
-        <w:t>The critical comparison is between Scenarios B and C: Bland–Altman analysis (figures 5 and 8) shows near-zero bias in both cases, yet CCC decomposition reveals fundamentally different error structures (table 2). Scenario B has C₂ = 1.000 (no systematic error), whereas Scenario C has C₂ = 0.870 (hidden gain error, v = 1.11). This demonstrates that Bland–Altman analysis alone cannot distinguish true agreement from agreement where gain error is masked by coincidental offset cancellation.</w:t>
+        <w:t>The critical comparison is between Scenarios B and C: Bland–Altman analysis (figures 5 and 6) shows near-zero bias in both cases, yet CCC decomposition reveals fundamentally different error structures (table 2). Scenario B has C₂ = 1.000 (no systematic error), whereas Scenario C has C₂ = 0.870 (hidden gain error, v = 1.11). This demonstrates that Bland–Altman analysis alone cannot distinguish true agreement from agreement where gain error is masked by coincidental offset cancellation.</w:t>
       </w:r>
     </w:p>
     <w:p>
@@ -853,7 +853,7 @@
           <w:i w:val="0"/>
           <w:sz w:val="24"/>
         </w:rPr>
-        <w:t>Figure 6 quantifies these relationships. Panel A shows C₂ as a function of gain error and DC offset, confirming that zero calibration (movement to zero offset) improves C₂ only when gain is correct. Panel B shows CCC degradation with gain error at different sensor precision levels (r), demonstrating that even high-precision sensors (r = 0.99) suffer substantial CCC reduction when gain error exceeds ±10%. Notably, typical MEMS sensors achieve gain accuracy within ±5%, corresponding to C₂ &gt; 0.99 at zero offset.</w:t>
+        <w:t>Figure 7 quantifies these relationships. Panel A shows C₂ as a function of gain error and DC offset, confirming that zero calibration (movement to zero offset) improves C₂ only when gain is correct. Panel B shows CCC degradation with gain error at different sensor precision levels (r), demonstrating that even high-precision sensors (r = 0.99) suffer substantial CCC reduction when gain error exceeds ±10%. Notably, typical MEMS sensors achieve gain accuracy within ±5%, corresponding to C₂ &gt; 0.99 at zero offset.</w:t>
       </w:r>
     </w:p>
     <w:p>
@@ -879,7 +879,7 @@
           <w:i w:val="0"/>
           <w:sz w:val="24"/>
         </w:rPr>
-        <w:t>Figure 7 provides quantitative demonstration of the PP–gain relationship. Simulated arterial pressure waveforms with correct gain (panel A), gain error (panel B), and DC offset only (panel C) show that PP is distorted by gain error but unaffected by DC offset. Panels D and E confirm that the slope of the PP regression line against the reference directly estimates sensor gain, providing a practical validation tool. The logical chain from PP accuracy to zero-calibration-free monitoring is summarised in panel F.</w:t>
+        <w:t>Figure 8 provides quantitative demonstration of the PP–gain relationship. Simulated arterial pressure waveforms with correct gain (panel A), gain error (panel B), and DC offset only (panel C) show that PP is distorted by gain error but unaffected by DC offset. Panels D and E confirm that the slope of the PP regression line against the reference directly estimates sensor gain, providing a practical validation tool. The logical chain from PP accuracy to zero-calibration-free monitoring is summarised in panel F.</w:t>
       </w:r>
     </w:p>
     <w:p>
@@ -917,7 +917,7 @@
           <w:i w:val="0"/>
           <w:sz w:val="24"/>
         </w:rPr>
-        <w:t>The framework presented here reframes zero calibration from a clinical necessity to a design workaround. Conventional fluid-filled systems require zeroing because their architecture inherently introduces DC offsets. Rather than continuing to refine calibration procedures, device manufacturers should pursue designs that eliminate the need for calibration entirely. The component technologies—catheter-tip MEMS, absolute pressure sensing, barometric compensation, and self-calibrating references—already exist individually in commercial or near-commercial products (Hasenkamp et al 2012, Song et al 2020, Millar 2026, 2026b, Kang et al 2022). Their integration into a single clinical arterial pressure monitoring system is an engineering challenge, not a scientific one.</w:t>
+        <w:t>The framework presented here reframes zero calibration from a clinical necessity to a design workaround. Conventional fluid-filled systems require zeroing because their architecture inherently introduces DC offsets. Rather than continuing to refine calibration procedures, device manufacturers should pursue designs that eliminate the need for calibration entirely. The component technologies—catheter-tip MEMS, absolute pressure sensing, barometric compensation, and self-calibrating references—already exist individually in commercial or near-commercial products (Hasenkamp et al 2012, Song et al 2020, Millar 2026, 2026b, Kang et al 2022), and high-fidelity pressure wires have already demonstrated the feasibility of accurate catheter-based pressure measurement (Scalia et al 2023). Their integration into a single clinical arterial pressure monitoring system is an engineering challenge, not a scientific one.</w:t>
       </w:r>
     </w:p>
     <w:p>
@@ -931,7 +931,7 @@
           <w:i w:val="0"/>
           <w:sz w:val="24"/>
         </w:rPr>
-        <w:t>The CCC decomposition provides a quantitative design target: device developers should aim for C₂ ≥ 0.99 without any calibration step, verifiable by comparing the uncalibrated device output against a reference standard. If C₂ &lt; 0.99 prior to calibration, the device has a residual systematic error that calibration can only partially mask. The decomposition into u and v further identifies whether the residual error is an offset (addressable by zeroing) or a gain error (requiring hardware or algorithmic correction).</w:t>
+        <w:t>The CCC decomposition provides a quantitative design target: device developers should aim for C₂ ≥ 0.99 without any calibration step—corresponding to “excellent” agreement under proposed strength-of-agreement criteria (McBride 2005)—verifiable by comparing the uncalibrated device output against a reference standard. If C₂ &lt; 0.99 prior to calibration, the device has a residual systematic error that calibration can only partially mask. The decomposition into u and v further identifies whether the residual error is an offset (addressable by zeroing) or a gain error (requiring hardware or algorithmic correction).</w:t>
       </w:r>
     </w:p>
     <w:p>
@@ -957,7 +957,7 @@
           <w:i w:val="0"/>
           <w:sz w:val="24"/>
         </w:rPr>
-        <w:t>Current regulatory pathways (e.g., FDA 510(k)) do not prescribe specific statistical methods for validating arterial pressure monitors (FDA 2026). Published validation studies overwhelmingly rely on Bland–Altman analysis and percentage error (Joosten et al 2017, Bland and Altman 1986). However, the Bland–Altman plot of a zeroed device will show bias ≈ 0, potentially masking proportional bias (gain error) within the limits of agreement. CCC reporting, particularly the C₂ component, would provide an additional layer of scrutiny that distinguishes offset correction from genuine measurement accuracy.</w:t>
+        <w:t>Current regulatory pathways (e.g., U.S. Food and Drug Administration [FDA] 510(k)) do not prescribe specific statistical methods for validating arterial pressure monitors (FDA 2026). Published validation studies overwhelmingly rely on Bland–Altman analysis and percentage error (Kim et al 2014, Joosten et al 2017, Bland and Altman 1986). However, the Bland–Altman plot of a zeroed device will show bias ≈ 0, potentially masking proportional bias (gain error) within the limits of agreement. CCC reporting, particularly the C₂ component, would provide an additional layer of scrutiny that distinguishes offset correction from genuine measurement accuracy.</w:t>
       </w:r>
     </w:p>
     <w:p>
@@ -997,7 +997,7 @@
           <w:i w:val="0"/>
           <w:sz w:val="24"/>
         </w:rPr>
-        <w:t>The principle that calibration corrects only offset (u) while leaving gain error (v) untouched extends naturally to non-invasive cardiac output (CO) monitors. ClearSight’s Physiocal algorithm periodically re-optimises the volume clamp setpoint—essentially an offset correction (Ameloot et al 2015). NICOM/Starling’s bioreactance phase reference provides a baseline offset for the phase-to-stroke-volume conversion (Squara et al 2007). FloTrac’s arterial waveform calibration adjusts the mean pressure offset (Manecke 2005). In every case, the auto-calibration routine addresses u (location shift) but does not correct v (scale shift)—that is, the gain of the pressure-to-CO or impedance-to-SV conversion.</w:t>
+        <w:t>The principle that calibration corrects only offset (u) while leaving gain error (v) untouched extends naturally to non-invasive cardiac output (CO) monitors, where the pulmonary artery catheter remains the clinical reference standard (Chatterjee 2009). ClearSight’s Physiocal algorithm periodically re-optimises the volume clamp setpoint—essentially an offset correction (Ameloot et al 2015). NICOM/Starling’s bioreactance phase reference provides a baseline offset for the phase-to-stroke-volume conversion (Squara et al 2007). FloTrac’s arterial waveform calibration adjusts the mean pressure offset (Manecke 2005, Romagnoli et al 2013). In every case, the auto-calibration routine addresses u (location shift) but does not correct v (scale shift)—that is, the gain of the pressure-to-CO or impedance-to-stroke volume (SV) conversion.</w:t>
       </w:r>
     </w:p>
     <w:p>
@@ -2952,8 +2952,65 @@
       <w:r>
         <w:drawing>
           <wp:inline xmlns:a="http://schemas.openxmlformats.org/drawingml/2006/main" xmlns:pic="http://schemas.openxmlformats.org/drawingml/2006/picture">
+            <wp:extent cx="5486400" cy="2543052"/>
+            <wp:docPr id="2" name="Picture 2"/>
+            <wp:cNvGraphicFramePr>
+              <a:graphicFrameLocks noChangeAspect="1"/>
+            </wp:cNvGraphicFramePr>
+            <a:graphic>
+              <a:graphicData uri="http://schemas.openxmlformats.org/drawingml/2006/picture">
+                <pic:pic>
+                  <pic:nvPicPr>
+                    <pic:cNvPr id="0" name="figure3_system_comparison.png"/>
+                    <pic:cNvPicPr/>
+                  </pic:nvPicPr>
+                  <pic:blipFill>
+                    <a:blip r:embed="rId10"/>
+                    <a:stretch>
+                      <a:fillRect/>
+                    </a:stretch>
+                  </pic:blipFill>
+                  <pic:spPr>
+                    <a:xfrm>
+                      <a:off x="0" y="0"/>
+                      <a:ext cx="5486400" cy="2543052"/>
+                    </a:xfrm>
+                    <a:prstGeom prst="rect"/>
+                  </pic:spPr>
+                </pic:pic>
+              </a:graphicData>
+            </a:graphic>
+          </wp:inline>
+        </w:drawing>
+      </w:r>
+    </w:p>
+    <w:p>
+      <w:pPr>
+        <w:spacing w:after="240"/>
+      </w:pPr>
+      <w:r>
+        <w:rPr>
+          <w:rFonts w:ascii="Times New Roman" w:hAnsi="Times New Roman"/>
+          <w:i/>
+          <w:sz w:val="20"/>
+        </w:rPr>
+        <w:t>Figure 2. Comparison of conventional and proposed zero-calibration-free arterial pressure monitoring systems. (A) Conventional fluid-filled system: three sources of DC offset (hydrostatic column, atmospheric pressure reference, transducer drift) necessitate manual zero calibration, which corrects offset (u) only. (B) Proposed zero-free system: catheter-tip MEMS sensor eliminates hydrostatic column; built-in barometer provides electronic atmospheric compensation; self-calibrating MEMS eliminates drift. All offset sources are eliminated by design, and PP accuracy validates gain (v = 1).</w:t>
+      </w:r>
+    </w:p>
+    <w:p>
+      <w:r>
+        <w:br w:type="page"/>
+      </w:r>
+    </w:p>
+    <w:p>
+      <w:pPr>
+        <w:jc w:val="center"/>
+      </w:pPr>
+      <w:r>
+        <w:drawing>
+          <wp:inline xmlns:a="http://schemas.openxmlformats.org/drawingml/2006/main" xmlns:pic="http://schemas.openxmlformats.org/drawingml/2006/picture">
             <wp:extent cx="5486400" cy="1404380"/>
-            <wp:docPr id="2" name="Picture 2"/>
+            <wp:docPr id="3" name="Picture 3"/>
             <wp:cNvGraphicFramePr>
               <a:graphicFrameLocks noChangeAspect="1"/>
             </wp:cNvGraphicFramePr>
@@ -2965,7 +3022,7 @@
                     <pic:cNvPicPr/>
                   </pic:nvPicPr>
                   <pic:blipFill>
-                    <a:blip r:embed="rId10"/>
+                    <a:blip r:embed="rId11"/>
                     <a:stretch>
                       <a:fillRect/>
                     </a:stretch>
@@ -2994,64 +3051,7 @@
           <w:i/>
           <w:sz w:val="20"/>
         </w:rPr>
-        <w:t>Figure 2. Concordance plots for four simulated scenarios (n = 150 paired measurements). (A) Before zeroing: offset of 12 mmHg produces location shift u = –0.55, reducing C₂ to 0.867. (B) After zeroing: offset removed, CCC = 0.986 with C₂ = 1.000. (C) Gain error (v = 1.11): zeroing cannot improve C₂ (0.870) because the scale shift persists. (D) Gain + offset: CCC = 0.976; zeroing would move the device from D to C but not to B. Dashed line = identity (y = x); solid line = best fit.</w:t>
-      </w:r>
-    </w:p>
-    <w:p>
-      <w:r>
-        <w:br w:type="page"/>
-      </w:r>
-    </w:p>
-    <w:p>
-      <w:pPr>
-        <w:jc w:val="center"/>
-      </w:pPr>
-      <w:r>
-        <w:drawing>
-          <wp:inline xmlns:a="http://schemas.openxmlformats.org/drawingml/2006/main" xmlns:pic="http://schemas.openxmlformats.org/drawingml/2006/picture">
-            <wp:extent cx="5486400" cy="2543052"/>
-            <wp:docPr id="3" name="Picture 3"/>
-            <wp:cNvGraphicFramePr>
-              <a:graphicFrameLocks noChangeAspect="1"/>
-            </wp:cNvGraphicFramePr>
-            <a:graphic>
-              <a:graphicData uri="http://schemas.openxmlformats.org/drawingml/2006/picture">
-                <pic:pic>
-                  <pic:nvPicPr>
-                    <pic:cNvPr id="0" name="figure3_system_comparison.png"/>
-                    <pic:cNvPicPr/>
-                  </pic:nvPicPr>
-                  <pic:blipFill>
-                    <a:blip r:embed="rId11"/>
-                    <a:stretch>
-                      <a:fillRect/>
-                    </a:stretch>
-                  </pic:blipFill>
-                  <pic:spPr>
-                    <a:xfrm>
-                      <a:off x="0" y="0"/>
-                      <a:ext cx="5486400" cy="2543052"/>
-                    </a:xfrm>
-                    <a:prstGeom prst="rect"/>
-                  </pic:spPr>
-                </pic:pic>
-              </a:graphicData>
-            </a:graphic>
-          </wp:inline>
-        </w:drawing>
-      </w:r>
-    </w:p>
-    <w:p>
-      <w:pPr>
-        <w:spacing w:after="240"/>
-      </w:pPr>
-      <w:r>
-        <w:rPr>
-          <w:rFonts w:ascii="Times New Roman" w:hAnsi="Times New Roman"/>
-          <w:i/>
-          <w:sz w:val="20"/>
-        </w:rPr>
-        <w:t>Figure 3. Comparison of conventional and proposed zero-calibration-free arterial pressure monitoring systems. (A) Conventional fluid-filled system: three sources of DC offset (hydrostatic column, atmospheric pressure reference, transducer drift) necessitate manual zero calibration, which corrects offset (u) only. (B) Proposed zero-free system: catheter-tip MEMS sensor eliminates hydrostatic column; built-in barometer provides electronic atmospheric compensation; self-calibrating MEMS eliminates drift. All offset sources are eliminated by design, and PP accuracy validates gain (v = 1).</w:t>
+        <w:t>Figure 3. Concordance plots for four simulated scenarios (n = 150 paired measurements). (A) Before zeroing: offset of 12 mmHg produces location shift u = –0.55, reducing C₂ to 0.867. (B) After zeroing: offset removed, CCC = 0.986 with C₂ = 1.000. (C) Gain error (v = 1.11): zeroing cannot improve C₂ (0.870) because the scale shift persists. (D) Gain + offset: CCC = 0.976; zeroing would move the device from D to C but not to B. Dashed line = identity (y = x); solid line = best fit.</w:t>
       </w:r>
     </w:p>
     <w:p>
@@ -3108,7 +3108,7 @@
           <w:i/>
           <w:sz w:val="20"/>
         </w:rPr>
-        <w:t>Figure 4. Bias correction factor (C₂) as a function of location shift (u) and scale shift (v). Contour lines show iso-C₂ values. Zero calibration moves a device horizontally (u → 0, green arrows) but does not change v. Points A–D correspond to the scenarios in figure 2. The gold star marks the ideal (u = 0, v = 1, C₂ = 1.0). A device with correct gain (v = 1, validated by PP accuracy) and offset-free design (u = 0) achieves C₂ = 1.0 without calibration.</w:t>
+        <w:t>Figure 4. Bias correction factor (C₂) as a function of location shift (u) and scale shift (v). Contour lines show iso-C₂ values. Zero calibration moves a device horizontally (u → 0, green arrows) but does not change v. Points A–D correspond to the scenarios in figure 3. The gold star marks the ideal (u = 0, v = 1, C₂ = 1.0). A device with correct gain (v = 1, validated by PP accuracy) and offset-free design (u = 0) achieves C₂ = 1.0 without calibration.</w:t>
       </w:r>
     </w:p>
     <w:p>
@@ -3180,8 +3180,65 @@
       <w:r>
         <w:drawing>
           <wp:inline xmlns:a="http://schemas.openxmlformats.org/drawingml/2006/main" xmlns:pic="http://schemas.openxmlformats.org/drawingml/2006/picture">
+            <wp:extent cx="5486400" cy="2986734"/>
+            <wp:docPr id="6" name="Picture 6"/>
+            <wp:cNvGraphicFramePr>
+              <a:graphicFrameLocks noChangeAspect="1"/>
+            </wp:cNvGraphicFramePr>
+            <a:graphic>
+              <a:graphicData uri="http://schemas.openxmlformats.org/drawingml/2006/picture">
+                <pic:pic>
+                  <pic:nvPicPr>
+                    <pic:cNvPr id="0" name="figure8_ba_vs_concordance.png"/>
+                    <pic:cNvPicPr/>
+                  </pic:nvPicPr>
+                  <pic:blipFill>
+                    <a:blip r:embed="rId14"/>
+                    <a:stretch>
+                      <a:fillRect/>
+                    </a:stretch>
+                  </pic:blipFill>
+                  <pic:spPr>
+                    <a:xfrm>
+                      <a:off x="0" y="0"/>
+                      <a:ext cx="5486400" cy="2986734"/>
+                    </a:xfrm>
+                    <a:prstGeom prst="rect"/>
+                  </pic:spPr>
+                </pic:pic>
+              </a:graphicData>
+            </a:graphic>
+          </wp:inline>
+        </w:drawing>
+      </w:r>
+    </w:p>
+    <w:p>
+      <w:pPr>
+        <w:spacing w:after="240"/>
+      </w:pPr>
+      <w:r>
+        <w:rPr>
+          <w:rFonts w:ascii="Times New Roman" w:hAnsi="Times New Roman"/>
+          <w:i/>
+          <w:sz w:val="20"/>
+        </w:rPr>
+        <w:t>Figure 6. Side-by-side comparison of Bland–Altman and concordance analysis for all four scenarios. Upper row: concordance plots (identity line = dashed); lower row: Bland–Altman plots. Bland–Altman analysis cannot distinguish Scenario B (true agreement) from Scenario D (gain error masked by offset), whereas the concordance plot and CCC decomposition clearly separate them.</w:t>
+      </w:r>
+    </w:p>
+    <w:p>
+      <w:r>
+        <w:br w:type="page"/>
+      </w:r>
+    </w:p>
+    <w:p>
+      <w:pPr>
+        <w:jc w:val="center"/>
+      </w:pPr>
+      <w:r>
+        <w:drawing>
+          <wp:inline xmlns:a="http://schemas.openxmlformats.org/drawingml/2006/main" xmlns:pic="http://schemas.openxmlformats.org/drawingml/2006/picture">
             <wp:extent cx="5486400" cy="2374676"/>
-            <wp:docPr id="6" name="Picture 6"/>
+            <wp:docPr id="7" name="Picture 7"/>
             <wp:cNvGraphicFramePr>
               <a:graphicFrameLocks noChangeAspect="1"/>
             </wp:cNvGraphicFramePr>
@@ -3193,7 +3250,7 @@
                     <pic:cNvPicPr/>
                   </pic:nvPicPr>
                   <pic:blipFill>
-                    <a:blip r:embed="rId14"/>
+                    <a:blip r:embed="rId15"/>
                     <a:stretch>
                       <a:fillRect/>
                     </a:stretch>
@@ -3222,7 +3279,7 @@
           <w:i/>
           <w:sz w:val="20"/>
         </w:rPr>
-        <w:t>Figure 6. Sensitivity analysis. (A) C₂ as a function of gain error and DC offset: zero calibration (movement to zero offset, vertical arrows) improves C₂ only when gain is correct (v = 1). (B) CCC degradation with increasing gain error at different precision levels (r = 0.95, 0.97, 0.99): even high-precision sensors suffer substantial CCC loss when gain error exceeds ±10%. Shaded region indicates typical MEMS gain accuracy (±5%).</w:t>
+        <w:t>Figure 7. Sensitivity analysis. (A) C₂ as a function of gain error and DC offset: zero calibration (movement to zero offset, vertical arrows) improves C₂ only when gain is correct (v = 1). (B) CCC degradation with increasing gain error at different precision levels (r = 0.95, 0.97, 0.99): even high-precision sensors suffer substantial CCC loss when gain error exceeds ±10%. Shaded region indicates typical MEMS gain accuracy (±5%).</w:t>
       </w:r>
     </w:p>
     <w:p>
@@ -3238,7 +3295,7 @@
         <w:drawing>
           <wp:inline xmlns:a="http://schemas.openxmlformats.org/drawingml/2006/main" xmlns:pic="http://schemas.openxmlformats.org/drawingml/2006/picture">
             <wp:extent cx="5486400" cy="3519922"/>
-            <wp:docPr id="7" name="Picture 7"/>
+            <wp:docPr id="8" name="Picture 8"/>
             <wp:cNvGraphicFramePr>
               <a:graphicFrameLocks noChangeAspect="1"/>
             </wp:cNvGraphicFramePr>
@@ -3250,7 +3307,7 @@
                     <pic:cNvPicPr/>
                   </pic:nvPicPr>
                   <pic:blipFill>
-                    <a:blip r:embed="rId15"/>
+                    <a:blip r:embed="rId16"/>
                     <a:stretch>
                       <a:fillRect/>
                     </a:stretch>
@@ -3279,64 +3336,7 @@
           <w:i/>
           <w:sz w:val="20"/>
         </w:rPr>
-        <w:t>Figure 7. Pulse pressure as an implicit gain validator. (A) Correct gain: PP is preserved. (B) Gain error (v = 1.15): PP is proportionally distorted. (C) DC offset only: PP is unchanged. (D–E) Regression of measured PP against reference PP: slope estimates sensor gain directly. (F) Logical chain from PP accuracy to zero-calibration-free monitoring.</w:t>
-      </w:r>
-    </w:p>
-    <w:p>
-      <w:r>
-        <w:br w:type="page"/>
-      </w:r>
-    </w:p>
-    <w:p>
-      <w:pPr>
-        <w:jc w:val="center"/>
-      </w:pPr>
-      <w:r>
-        <w:drawing>
-          <wp:inline xmlns:a="http://schemas.openxmlformats.org/drawingml/2006/main" xmlns:pic="http://schemas.openxmlformats.org/drawingml/2006/picture">
-            <wp:extent cx="5486400" cy="2986734"/>
-            <wp:docPr id="8" name="Picture 8"/>
-            <wp:cNvGraphicFramePr>
-              <a:graphicFrameLocks noChangeAspect="1"/>
-            </wp:cNvGraphicFramePr>
-            <a:graphic>
-              <a:graphicData uri="http://schemas.openxmlformats.org/drawingml/2006/picture">
-                <pic:pic>
-                  <pic:nvPicPr>
-                    <pic:cNvPr id="0" name="figure8_ba_vs_concordance.png"/>
-                    <pic:cNvPicPr/>
-                  </pic:nvPicPr>
-                  <pic:blipFill>
-                    <a:blip r:embed="rId16"/>
-                    <a:stretch>
-                      <a:fillRect/>
-                    </a:stretch>
-                  </pic:blipFill>
-                  <pic:spPr>
-                    <a:xfrm>
-                      <a:off x="0" y="0"/>
-                      <a:ext cx="5486400" cy="2986734"/>
-                    </a:xfrm>
-                    <a:prstGeom prst="rect"/>
-                  </pic:spPr>
-                </pic:pic>
-              </a:graphicData>
-            </a:graphic>
-          </wp:inline>
-        </w:drawing>
-      </w:r>
-    </w:p>
-    <w:p>
-      <w:pPr>
-        <w:spacing w:after="240"/>
-      </w:pPr>
-      <w:r>
-        <w:rPr>
-          <w:rFonts w:ascii="Times New Roman" w:hAnsi="Times New Roman"/>
-          <w:i/>
-          <w:sz w:val="20"/>
-        </w:rPr>
-        <w:t>Figure 8. Side-by-side comparison of Bland–Altman and concordance analysis for all four scenarios. Upper row: concordance plots (identity line = dashed); lower row: Bland–Altman plots. Bland–Altman analysis cannot distinguish Scenario B (true agreement) from Scenario D (gain error masked by offset), whereas the concordance plot and CCC decomposition clearly separate them.</w:t>
+        <w:t>Figure 8. Pulse pressure as an implicit gain validator. (A) Correct gain: PP is preserved. (B) Gain error (v = 1.15): PP is proportionally distorted. (C) DC offset only: PP is unchanged. (D–E) Regression of measured PP against reference PP: slope estimates sensor gain directly. (F) Logical chain from PP accuracy to zero-calibration-free monitoring.</w:t>
       </w:r>
     </w:p>
     <w:sectPr>

</xml_diff>

<commit_message>
Fix abbreviation definitions: ensure all abbreviations defined at first use in abstract AND main text
EN & JA scripts:
- DC: defined at first use in abstract ('direct-current (DC) offset') and introduction
- MEMS: re-defined at first use in main text §2.2 (was only defined in abstract)
- SD: defined as 'standard deviation [SD]' at first use in §2.5
- NICOM: defined as 'Noninvasive cardiac output monitoring (NICOM)' in §4.3
- AC/DC section heading: spelled out as 'alternating-current and direct-current'
- Removed redundant re-definitions where abbreviation was already defined earlier

Co-Authored-By: Tatsuki Onishi <bougtoir@gmail.com>
</commit_message>
<xml_diff>
--- a/zero_calibration_pmea/manuscripts/PMEA_ZeroFree_Manuscript_EN.docx
+++ b/zero_calibration_pmea/manuscripts/PMEA_ZeroFree_Manuscript_EN.docx
@@ -284,7 +284,7 @@
           <w:i w:val="0"/>
           <w:sz w:val="24"/>
         </w:rPr>
-        <w:t>After zero calibration, Bland–Altman analysis shows near-zero bias regardless of whether gain error exists (bias: −0.1 vs 1.1 mmHg for gain-free vs gain-error scenarios). In contrast, CCC decomposition clearly distinguishes these cases: C₂ = 1.000 (no gain error) versus C₂ = 0.870 (10% gain error, v = 1.11). We show that pulse pressure accuracy serves as an implicit gain validator, since pulse pressure is independent of DC offset but proportional to sensor gain.</w:t>
+        <w:t>After zero calibration, Bland–Altman analysis shows near-zero bias regardless of whether gain error exists (bias: −0.1 vs 1.1 mmHg for gain-free vs gain-error scenarios). In contrast, CCC decomposition clearly distinguishes these cases: C₂ = 1.000 (no gain error) versus C₂ = 0.870 (10% gain error, v = 1.11). We show that pulse pressure accuracy serves as an implicit gain validator,     since pulse pressure is independent of direct-current (DC) offset but proportional to sensor gain.</w:t>
       </w:r>
     </w:p>
     <w:p>
@@ -357,7 +357,7 @@
           <w:i w:val="0"/>
           <w:sz w:val="24"/>
         </w:rPr>
-        <w:t>The persistence of this requirement is not a fundamental physical necessity but a consequence of how conventional monitoring systems are designed. In a standard fluid-filled arterial line, the pressure transducer is located externally, connected to the intravascular catheter tip by a column of saline. This architecture introduces three systematic sources of DC offset: (1) the hydrostatic pressure difference between the transducer and the measurement site (ΔP = ρgh, approximately 0.74 mmHg per centimetre of height difference); (2) the need to measure gauge pressure relative to atmospheric pressure (~760 mmHg); and (3) transducer drift over time due to mechanical creep or thermal effects in the strain gauge (Mark 1998, McGhee and Bridges 2002). Zero calibration removes all three offsets simultaneously by exposing the transducer to atmosphere and resetting the output to zero.</w:t>
+        <w:t>The persistence of this requirement is not a fundamental physical necessity but a consequence of how conventional monitoring systems are designed. In a standard fluid-filled arterial line, the pressure transducer is located externally, connected to the intravascular catheter tip by a column of saline. This architecture introduces three systematic sources of direct-current (DC) offset: (1) the hydrostatic pressure difference between the transducer and the measurement site (ΔP = ρgh, approximately 0.74 mmHg per centimetre of height difference); (2) the need to measure gauge pressure relative to atmospheric pressure (~760 mmHg); and (3) transducer drift over time due to mechanical creep or thermal effects in the strain gauge (Mark 1998, McGhee and Bridges 2002). Zero calibration removes all three offsets simultaneously by exposing the transducer to atmosphere and resetting the output to zero.</w:t>
       </w:r>
     </w:p>
     <w:p>
@@ -423,7 +423,7 @@
           <w:rFonts w:ascii="Times New Roman" w:hAnsi="Times New Roman"/>
           <w:color w:val="000000"/>
         </w:rPr>
-        <w:t>2.1. Arterial pressure as the sum of AC and DC components</w:t>
+        <w:t>2.1. Arterial pressure as the sum of alternating-current and direct-current components</w:t>
       </w:r>
     </w:p>
     <w:p>
@@ -437,7 +437,7 @@
           <w:i w:val="0"/>
           <w:sz w:val="24"/>
         </w:rPr>
-        <w:t>An arterial pressure waveform P(t) can be decomposed into a slowly varying component (the direct-current (DC) level, determined by mean arterial pressure and any external offsets) and a pulsatile component (the alternating-current (AC) signal, driven by cardiac ejection). Pulse pressure (PP = systolic blood pressure [SBP] – diastolic blood pressure [DBP]) is a pure AC quantity: it represents the difference between the maximum and minimum of the pulsatile excursion and is, by definition, independent of any additive DC offset (figure 1, panels A and B).</w:t>
+        <w:t>An arterial pressure waveform P(t) can be decomposed into a slowly varying component (the DC level, determined by mean arterial pressure and any external offsets) and a pulsatile component (the alternating-current [AC] signal, driven by cardiac ejection). Pulse pressure (PP = systolic blood pressure [SBP] – diastolic blood pressure [DBP]) is a pure AC quantity: it represents the difference between the maximum and minimum of the pulsatile excursion and is, by definition, independent of any additive DC offset (figure 1, panels A and B).</w:t>
       </w:r>
     </w:p>
     <w:p>
@@ -491,7 +491,7 @@
           <w:i w:val="0"/>
           <w:sz w:val="24"/>
         </w:rPr>
-        <w:t>(1) Hydrostatic column offset: Catheter-tip MEMS pressure sensors (e.g., Millar Mikro-Cath) place the sensing element directly at the catheter tip, eliminating the fluid column entirely (Hasenkamp et al 2012, Song et al 2020). The sensor measures pressure at the point of interest, making the measurement independent of the transducer-to-patient height relationship (Millar 2026).</w:t>
+        <w:t>(1) Hydrostatic column offset: Catheter-tip micro-electro-mechanical systems (MEMS) pressure sensors (e.g., Millar Mikro-Cath) place the sensing element directly at the catheter tip, eliminating the fluid column entirely (Hasenkamp et al 2012, Song et al 2020). The sensor measures pressure at the point of interest, making the measurement independent of the transducer-to-patient height relationship (Millar 2026).</w:t>
       </w:r>
     </w:p>
     <w:p>
@@ -667,7 +667,7 @@
           <w:i w:val="0"/>
           <w:sz w:val="24"/>
         </w:rPr>
-        <w:t>We simulated four clinically relevant scenarios of arterial pressure measurement, each comprising n = 150 paired measurements with true systolic pressures ranging from 80 to 180 mmHg. Scenario A: offset only (12 mmHg systematic offset before zeroing). Scenario B: after zeroing (offset removed, no gain error). Scenario C: gain error only (v = 1.11, i.e. 11% overestimation of pressure changes). Scenario D: combined gain error plus offset. Gaussian noise (SD = 3.5 mmHg) was added to all scenarios to simulate physiological and measurement variability. Each scenario was analysed using both Bland–Altman statistics (bias, limits of agreement, percentage error) and full CCC decomposition (ρc, r, C₂, u, v).</w:t>
+        <w:t>We simulated four clinically relevant scenarios of arterial pressure measurement, each comprising n = 150 paired measurements with true systolic pressures ranging from 80 to 180 mmHg. Scenario A: offset only (12 mmHg systematic offset before zeroing). Scenario B: after zeroing (offset removed, no gain error). Scenario C: gain error only (v = 1.11, i.e. 11% overestimation of pressure changes). Scenario D: combined gain error plus offset. Gaussian noise (standard deviation [SD] = 3.5 mmHg) was added to all scenarios to simulate physiological and measurement variability. Each scenario was analysed using both Bland–Altman statistics (bias, limits of agreement, percentage error) and full CCC decomposition (ρc, r, C₂, u, v).</w:t>
       </w:r>
     </w:p>
     <w:p>
@@ -997,7 +997,7 @@
           <w:i w:val="0"/>
           <w:sz w:val="24"/>
         </w:rPr>
-        <w:t>The principle that calibration corrects only offset (u) while leaving gain error (v) untouched extends naturally to non-invasive cardiac output (CO) monitors, where the pulmonary artery catheter remains the clinical reference standard (Chatterjee 2009). ClearSight’s Physiocal algorithm periodically re-optimises the volume clamp setpoint—essentially an offset correction (Ameloot et al 2015). NICOM/Starling’s bioreactance phase reference provides a baseline offset for the phase-to-stroke-volume conversion (Squara et al 2007). FloTrac’s arterial waveform calibration adjusts the mean pressure offset (Manecke 2005, Romagnoli et al 2013). In every case, the auto-calibration routine addresses u (location shift) but does not correct v (scale shift)—that is, the gain of the pressure-to-CO or impedance-to-stroke volume (SV) conversion.</w:t>
+        <w:t>The principle that calibration corrects only offset (u) while leaving gain error (v) untouched extends naturally to non-invasive cardiac output (CO) monitors, where the pulmonary artery catheter remains the clinical reference standard (Chatterjee 2009). ClearSight’s Physiocal algorithm periodically re-optimises the volume clamp setpoint—essentially an offset correction (Ameloot et al 2015). Noninvasive cardiac output monitoring (NICOM)/Starling’s bioreactance phase reference provides a baseline offset for the phase-to-stroke-volume conversion (Squara et al 2007). FloTrac’s arterial waveform calibration adjusts the mean pressure offset (Manecke 2005, Romagnoli et al 2013). In every case, the auto-calibration routine addresses u (location shift) but does not correct v (scale shift)—that is, the gain of the pressure-to-CO or impedance-to-stroke volume (SV) conversion.</w:t>
       </w:r>
     </w:p>
     <w:p>

</xml_diff>